<commit_message>
docs: add Spec 075 and prompt P5_9_53 for vector illustration rasterization
</commit_message>
<xml_diff>
--- a/fixtures/Get_Started_With_Smallpdf.docx
+++ b/fixtures/Get_Started_With_Smallpdf.docx
@@ -23,7 +23,11 @@
         <w:rPr/>
       </w:pPr>
       <w:r>
-        <w:rPr/>
+        <w:rPr>
+          <w:sz w:val="19"/>
+          <w:szCs w:val="19"/>
+          <w:color w:val="525C68"/>
+        </w:rPr>
         <w:t xml:space="preserve">Ready to take document management to the next level?</w:t>
       </w:r>
     </w:p>
@@ -46,33 +50,55 @@
         <w:trPr/>
         <w:tc>
           <w:tcPr>
-            <w:tcW w:w="5000" w:type="dxa"/>
-          </w:tcPr>
-          <w:p>
-            <w:pPr>
-              <w:rPr/>
-              <w:jc w:val="center"/>
-            </w:pPr>
-            <w:r>
-              <w:rPr>
-                <w:sz w:val="22"/>
-                <w:szCs w:val="22"/>
-                <w:color w:val="757E8A"/>
+            <w:tcW w:w="3168" w:type="dxa"/>
+          </w:tcPr>
+          <w:p>
+            <w:pPr>
+              <w:rPr/>
+              <w:jc w:val="center"/>
+            </w:pPr>
+            <w:r>
+              <w:rPr>
+                <w:sz w:val="18"/>
+                <w:szCs w:val="18"/>
+                <w:color w:val="007AFF"/>
+                <w:i/>
+                <w:iCs/>
+              </w:rPr>
+              <w:t xml:space="preserve">[ Feature 1 Illustration ]</w:t>
+            </w:r>
+          </w:p>
+        </w:tc>
+        <w:tc>
+          <w:tcPr>
+            <w:tcW w:w="6912" w:type="dxa"/>
+          </w:tcPr>
+          <w:p>
+            <w:pPr>
+              <w:rPr/>
+              <w:jc w:val="center"/>
+            </w:pPr>
+            <w:r>
+              <w:rPr>
+                <w:sz w:val="24"/>
+                <w:szCs w:val="24"/>
+                <w:color w:val="1F242E"/>
+                <w:b/>
+                <w:bCs/>
               </w:rPr>
               <w:t xml:space="preserve">Digital Documents—All In One Place</w:t>
             </w:r>
           </w:p>
-        </w:tc>
-        <w:tc>
-          <w:tcPr>
-            <w:tcW w:w="5000" w:type="dxa"/>
-          </w:tcPr>
-          <w:p>
-            <w:pPr>
-              <w:rPr/>
-            </w:pPr>
-            <w:r>
-              <w:rPr/>
+          <w:p>
+            <w:pPr>
+              <w:rPr/>
+            </w:pPr>
+            <w:r>
+              <w:rPr>
+                <w:sz w:val="19"/>
+                <w:szCs w:val="19"/>
+                <w:color w:val="525C68"/>
+              </w:rPr>
               <w:t xml:space="preserve">With the new Smallpdf experience, you can freely upload, organize, and share digital documents. When you enable the ‘Storage’ option, we’ll also store all processed files here.</w:t>
             </w:r>
           </w:p>
@@ -98,34 +124,56 @@
         <w:trPr/>
         <w:tc>
           <w:tcPr>
-            <w:tcW w:w="5000" w:type="dxa"/>
-          </w:tcPr>
-          <w:p>
-            <w:pPr>
-              <w:rPr/>
-              <w:jc w:val="center"/>
-            </w:pPr>
-            <w:r>
-              <w:rPr>
-                <w:sz w:val="22"/>
-                <w:szCs w:val="22"/>
-                <w:color w:val="757E8A"/>
+            <w:tcW w:w="6912" w:type="dxa"/>
+          </w:tcPr>
+          <w:p>
+            <w:pPr>
+              <w:rPr/>
+              <w:jc w:val="center"/>
+            </w:pPr>
+            <w:r>
+              <w:rPr>
+                <w:sz w:val="24"/>
+                <w:szCs w:val="24"/>
+                <w:color w:val="1F242E"/>
+                <w:b/>
+                <w:bCs/>
               </w:rPr>
               <w:t xml:space="preserve">Enhance Documents in One Click</w:t>
             </w:r>
           </w:p>
-        </w:tc>
-        <w:tc>
-          <w:tcPr>
-            <w:tcW w:w="5000" w:type="dxa"/>
-          </w:tcPr>
-          <w:p>
-            <w:pPr>
-              <w:rPr/>
-            </w:pPr>
-            <w:r>
-              <w:rPr/>
+          <w:p>
+            <w:pPr>
+              <w:rPr/>
+            </w:pPr>
+            <w:r>
+              <w:rPr>
+                <w:sz w:val="19"/>
+                <w:szCs w:val="19"/>
+                <w:color w:val="525C68"/>
+              </w:rPr>
               <w:t xml:space="preserve">When you right-click on a file, we’ll present you with an array of options to convert, compress, or modify it.</w:t>
+            </w:r>
+          </w:p>
+        </w:tc>
+        <w:tc>
+          <w:tcPr>
+            <w:tcW w:w="3168" w:type="dxa"/>
+          </w:tcPr>
+          <w:p>
+            <w:pPr>
+              <w:rPr/>
+              <w:jc w:val="center"/>
+            </w:pPr>
+            <w:r>
+              <w:rPr>
+                <w:sz w:val="18"/>
+                <w:szCs w:val="18"/>
+                <w:color w:val="007AFF"/>
+                <w:i/>
+                <w:iCs/>
+              </w:rPr>
+              <w:t xml:space="preserve">[ Feature 2 Illustration ]</w:t>
             </w:r>
           </w:p>
         </w:tc>
@@ -150,33 +198,55 @@
         <w:trPr/>
         <w:tc>
           <w:tcPr>
-            <w:tcW w:w="5000" w:type="dxa"/>
-          </w:tcPr>
-          <w:p>
-            <w:pPr>
-              <w:rPr/>
-              <w:jc w:val="center"/>
-            </w:pPr>
-            <w:r>
-              <w:rPr>
-                <w:sz w:val="22"/>
-                <w:szCs w:val="22"/>
-                <w:color w:val="757E8A"/>
+            <w:tcW w:w="3168" w:type="dxa"/>
+          </w:tcPr>
+          <w:p>
+            <w:pPr>
+              <w:rPr/>
+              <w:jc w:val="center"/>
+            </w:pPr>
+            <w:r>
+              <w:rPr>
+                <w:sz w:val="18"/>
+                <w:szCs w:val="18"/>
+                <w:color w:val="007AFF"/>
+                <w:i/>
+                <w:iCs/>
+              </w:rPr>
+              <w:t xml:space="preserve">[ Feature 3 Illustration ]</w:t>
+            </w:r>
+          </w:p>
+        </w:tc>
+        <w:tc>
+          <w:tcPr>
+            <w:tcW w:w="6912" w:type="dxa"/>
+          </w:tcPr>
+          <w:p>
+            <w:pPr>
+              <w:rPr/>
+              <w:jc w:val="center"/>
+            </w:pPr>
+            <w:r>
+              <w:rPr>
+                <w:sz w:val="24"/>
+                <w:szCs w:val="24"/>
+                <w:color w:val="1F242E"/>
+                <w:b/>
+                <w:bCs/>
               </w:rPr>
               <w:t xml:space="preserve">Access Files Anytime, Anywhere</w:t>
             </w:r>
           </w:p>
-        </w:tc>
-        <w:tc>
-          <w:tcPr>
-            <w:tcW w:w="5000" w:type="dxa"/>
-          </w:tcPr>
-          <w:p>
-            <w:pPr>
-              <w:rPr/>
-            </w:pPr>
-            <w:r>
-              <w:rPr/>
+          <w:p>
+            <w:pPr>
+              <w:rPr/>
+            </w:pPr>
+            <w:r>
+              <w:rPr>
+                <w:sz w:val="19"/>
+                <w:szCs w:val="19"/>
+                <w:color w:val="525C68"/>
+              </w:rPr>
               <w:t xml:space="preserve">You can access files stored on Smallpdf from your computer, phone, or tablet. We’ll also sync files from the Smallpdf Mobile App to our online portal</w:t>
             </w:r>
           </w:p>
@@ -202,34 +272,56 @@
         <w:trPr/>
         <w:tc>
           <w:tcPr>
-            <w:tcW w:w="5000" w:type="dxa"/>
-          </w:tcPr>
-          <w:p>
-            <w:pPr>
-              <w:rPr/>
-              <w:jc w:val="center"/>
-            </w:pPr>
-            <w:r>
-              <w:rPr>
-                <w:sz w:val="22"/>
-                <w:szCs w:val="22"/>
-                <w:color w:val="757E8A"/>
+            <w:tcW w:w="6912" w:type="dxa"/>
+          </w:tcPr>
+          <w:p>
+            <w:pPr>
+              <w:rPr/>
+              <w:jc w:val="center"/>
+            </w:pPr>
+            <w:r>
+              <w:rPr>
+                <w:sz w:val="24"/>
+                <w:szCs w:val="24"/>
+                <w:color w:val="1F242E"/>
+                <w:b/>
+                <w:bCs/>
               </w:rPr>
               <w:t xml:space="preserve">Collaborate With Others</w:t>
             </w:r>
           </w:p>
-        </w:tc>
-        <w:tc>
-          <w:tcPr>
-            <w:tcW w:w="5000" w:type="dxa"/>
-          </w:tcPr>
-          <w:p>
-            <w:pPr>
-              <w:rPr/>
-            </w:pPr>
-            <w:r>
-              <w:rPr/>
+          <w:p>
+            <w:pPr>
+              <w:rPr/>
+            </w:pPr>
+            <w:r>
+              <w:rPr>
+                <w:sz w:val="19"/>
+                <w:szCs w:val="19"/>
+                <w:color w:val="525C68"/>
+              </w:rPr>
               <w:t xml:space="preserve">Forget mundane administrative tasks. With Smallpdf, you can request e-signatures, send large files, or even enable the Smallpdf G Suite App for your entire organization.</w:t>
+            </w:r>
+          </w:p>
+        </w:tc>
+        <w:tc>
+          <w:tcPr>
+            <w:tcW w:w="3168" w:type="dxa"/>
+          </w:tcPr>
+          <w:p>
+            <w:pPr>
+              <w:rPr/>
+              <w:jc w:val="center"/>
+            </w:pPr>
+            <w:r>
+              <w:rPr>
+                <w:sz w:val="18"/>
+                <w:szCs w:val="18"/>
+                <w:color w:val="007AFF"/>
+                <w:i/>
+                <w:iCs/>
+              </w:rPr>
+              <w:t xml:space="preserve">[ Feature 4 Illustration ]</w:t>
             </w:r>
           </w:p>
         </w:tc>

</xml_diff>